<commit_message>
fix(vat-tu): ảnh liên 3 mở popup nổi trên hộp chi tiết phiếu + cập nhật chú thích 3 mẫu BBNT D-Office
- Popup "Ảnh phiếu xuất kho liên 3" ở bước Nghiệm thu nằm khuất sau hộp chi tiết phiếu:
  Dialog mặc định z-50 gắn vào body, còn .ticket-detail-layer z-index 60. Nâng lớp phủ và
  nội dung lên z-[80]; components/ui/dialog thêm prop tuỳ chọn overlayClassName (các chỗ
  khác không đổi).
- Mẫu BBNT D-Office do PXVH1 chỉnh: bi — chú thích "trước/sau khi bổ sung bi" (chữ thường);
  dầu, lõi lọc — sửa "Thống số" → "Thông số". Không đổi token, bảng ảnh giữ số cột
  (bi 2, dầu/lõi 3); đã dựng thử cả ba mẫu.

Co-Authored-By: Claude Opus 5 <noreply@anthropic.com>
</commit_message>
<xml_diff>
--- a/templates/bbnt-do-template-bi.docx
+++ b/templates/bbnt-do-template-bi.docx
@@ -370,15 +370,33 @@
           <w:sz w:val="28"/>
           <w:szCs w:val="28"/>
         </w:rPr>
-        <w:t>{{pctNumber}}</w:t>
-      </w:r>
-      <w:r>
-        <w:rPr>
-          <w:rFonts w:ascii="Times New Roman" w:hAnsi="Times New Roman" w:cs="Times New Roman"/>
-          <w:sz w:val="28"/>
-          <w:szCs w:val="28"/>
-        </w:rPr>
-        <w:t>{{pctContent}}</w:t>
+        <w:t>{{pctNumber</w:t>
+      </w:r>
+      <w:proofErr w:type="gramStart"/>
+      <w:r>
+        <w:rPr>
+          <w:rFonts w:ascii="Times New Roman" w:hAnsi="Times New Roman" w:cs="Times New Roman"/>
+          <w:sz w:val="28"/>
+          <w:szCs w:val="28"/>
+        </w:rPr>
+        <w:t>}}</w:t>
+      </w:r>
+      <w:r>
+        <w:rPr>
+          <w:rFonts w:ascii="Times New Roman" w:hAnsi="Times New Roman" w:cs="Times New Roman"/>
+          <w:sz w:val="28"/>
+          <w:szCs w:val="28"/>
+        </w:rPr>
+        <w:t>{</w:t>
+      </w:r>
+      <w:proofErr w:type="gramEnd"/>
+      <w:r>
+        <w:rPr>
+          <w:rFonts w:ascii="Times New Roman" w:hAnsi="Times New Roman" w:cs="Times New Roman"/>
+          <w:sz w:val="28"/>
+          <w:szCs w:val="28"/>
+        </w:rPr>
+        <w:t>{pctContent}}</w:t>
       </w:r>
     </w:p>
     <w:p>
@@ -441,6 +459,7 @@
         </w:rPr>
         <w:t xml:space="preserve">Đại diện phòng Kỹ thuật và </w:t>
       </w:r>
+      <w:proofErr w:type="gramStart"/>
       <w:r>
         <w:rPr>
           <w:rFonts w:ascii="Times New Roman" w:hAnsi="Times New Roman" w:cs="Times New Roman"/>
@@ -459,7 +478,18 @@
           <w:sz w:val="28"/>
           <w:szCs w:val="28"/>
         </w:rPr>
-        <w:t>n toàn</w:t>
+        <w:t>n</w:t>
+      </w:r>
+      <w:proofErr w:type="gramEnd"/>
+      <w:r>
+        <w:rPr>
+          <w:rFonts w:ascii="Times New Roman" w:hAnsi="Times New Roman" w:cs="Times New Roman"/>
+          <w:b/>
+          <w:iCs/>
+          <w:sz w:val="28"/>
+          <w:szCs w:val="28"/>
+        </w:rPr>
+        <w:t xml:space="preserve"> toàn</w:t>
       </w:r>
     </w:p>
     <w:p>
@@ -1132,8 +1162,18 @@
           <w:sz w:val="28"/>
           <w:szCs w:val="28"/>
         </w:rPr>
-        <w:t>ố: …..</w:t>
-      </w:r>
+        <w:t xml:space="preserve">ố: </w:t>
+      </w:r>
+      <w:proofErr w:type="gramStart"/>
+      <w:r>
+        <w:rPr>
+          <w:rFonts w:ascii="Times New Roman" w:hAnsi="Times New Roman" w:cs="Times New Roman"/>
+          <w:sz w:val="28"/>
+          <w:szCs w:val="28"/>
+        </w:rPr>
+        <w:t>…..</w:t>
+      </w:r>
+      <w:proofErr w:type="gramEnd"/>
       <w:r>
         <w:rPr>
           <w:rFonts w:ascii="Times New Roman" w:hAnsi="Times New Roman" w:cs="Times New Roman"/>
@@ -1172,7 +1212,25 @@
           <w:sz w:val="28"/>
           <w:szCs w:val="28"/>
         </w:rPr>
-        <w:t xml:space="preserve"> của Phòng Kỹ thuật và An toàn về việc …</w:t>
+        <w:t xml:space="preserve"> của Phòng Kỹ thuật và </w:t>
+      </w:r>
+      <w:proofErr w:type="gramStart"/>
+      <w:r>
+        <w:rPr>
+          <w:rFonts w:ascii="Times New Roman" w:hAnsi="Times New Roman" w:cs="Times New Roman"/>
+          <w:sz w:val="28"/>
+          <w:szCs w:val="28"/>
+        </w:rPr>
+        <w:t>An</w:t>
+      </w:r>
+      <w:proofErr w:type="gramEnd"/>
+      <w:r>
+        <w:rPr>
+          <w:rFonts w:ascii="Times New Roman" w:hAnsi="Times New Roman" w:cs="Times New Roman"/>
+          <w:sz w:val="28"/>
+          <w:szCs w:val="28"/>
+        </w:rPr>
+        <w:t xml:space="preserve"> toàn về việc …</w:t>
       </w:r>
       <w:r>
         <w:rPr>
@@ -2580,7 +2638,23 @@
                 <w:sz w:val="28"/>
                 <w:szCs w:val="28"/>
               </w:rPr>
-              <w:t xml:space="preserve">Hình 1: Hình ảnh DCS MILL OVERVIEW TRƯỚC khi bổ sung bi</w:t>
+              <w:t xml:space="preserve">Hình 1: Hình ảnh DCS MILL OVERVIEW </w:t>
+            </w:r>
+            <w:r>
+              <w:rPr>
+                <w:rFonts w:ascii="Times New Roman" w:hAnsi="Times New Roman" w:cs="Times New Roman"/>
+                <w:sz w:val="28"/>
+                <w:szCs w:val="28"/>
+              </w:rPr>
+              <w:t>trước</w:t>
+            </w:r>
+            <w:r>
+              <w:rPr>
+                <w:rFonts w:ascii="Times New Roman" w:hAnsi="Times New Roman" w:cs="Times New Roman"/>
+                <w:sz w:val="28"/>
+                <w:szCs w:val="28"/>
+              </w:rPr>
+              <w:t xml:space="preserve"> khi bổ sung bi</w:t>
             </w:r>
           </w:p>
         </w:tc>
@@ -2607,7 +2681,23 @@
                 <w:sz w:val="28"/>
                 <w:szCs w:val="28"/>
               </w:rPr>
-              <w:t xml:space="preserve">Hình 2: Hình ảnh DCS MILL OVERVIEW SAU khi bổ sung bi</w:t>
+              <w:t xml:space="preserve">Hình 2: Hình ảnh DCS MILL OVERVIEW </w:t>
+            </w:r>
+            <w:r>
+              <w:rPr>
+                <w:rFonts w:ascii="Times New Roman" w:hAnsi="Times New Roman" w:cs="Times New Roman"/>
+                <w:sz w:val="28"/>
+                <w:szCs w:val="28"/>
+              </w:rPr>
+              <w:t>sau</w:t>
+            </w:r>
+            <w:r>
+              <w:rPr>
+                <w:rFonts w:ascii="Times New Roman" w:hAnsi="Times New Roman" w:cs="Times New Roman"/>
+                <w:sz w:val="28"/>
+                <w:szCs w:val="28"/>
+              </w:rPr>
+              <w:t xml:space="preserve"> khi bổ sung bi</w:t>
             </w:r>
           </w:p>
         </w:tc>
@@ -4345,7 +4435,25 @@
                 <w:sz w:val="22"/>
                 <w:szCs w:val="22"/>
               </w:rPr>
-              <w:t>{{#items}}{{stt}}</w:t>
+              <w:t>{{#items</w:t>
+            </w:r>
+            <w:proofErr w:type="gramStart"/>
+            <w:r>
+              <w:rPr>
+                <w:rFonts w:ascii="Times New Roman" w:hAnsi="Times New Roman" w:cs="Times New Roman"/>
+                <w:sz w:val="22"/>
+                <w:szCs w:val="22"/>
+              </w:rPr>
+              <w:t>}}{</w:t>
+            </w:r>
+            <w:proofErr w:type="gramEnd"/>
+            <w:r>
+              <w:rPr>
+                <w:rFonts w:ascii="Times New Roman" w:hAnsi="Times New Roman" w:cs="Times New Roman"/>
+                <w:sz w:val="22"/>
+                <w:szCs w:val="22"/>
+              </w:rPr>
+              <w:t>{stt}}</w:t>
             </w:r>
           </w:p>
         </w:tc>

</xml_diff>